<commit_message>
Publish color workbooks with serif reading text and align W2 classroom flow
</commit_message>
<xml_diff>
--- a/worksheets/W2_PlanB匿名事件卡與六句_學生版.docx
+++ b/worksheets/W2_PlanB匿名事件卡與六句_學生版.docx
@@ -34,7 +34,7 @@
           <w:color w:val="1A2340"/>
           <w:sz w:val="44"/>
         </w:rPr>
-        <w:t>公共廣告＋配對六句</w:t>
+        <w:t>廣告摘要＋備用六句</w:t>
       </w:r>
     </w:p>
     <w:p>
@@ -51,7 +51,7 @@
           <w:color w:val="5B6573"/>
           <w:sz w:val="22"/>
         </w:rPr>
-        <w:t>先完成本人3–4句，再看六句；這是教師編寫待查材料，不是AI實測。</w:t>
+        <w:t>先自己寫3–4句，再看備用六句；六句由老師編寫，不是AI的實際回答。</w:t>
       </w:r>
     </w:p>
     <w:p>
@@ -68,7 +68,7 @@
           <w:color w:val="1A2340"/>
           <w:sz w:val="22"/>
         </w:rPr>
-        <w:t>W2 0分練習，材料與六句成對使用；判斷仍由本人完成。</w:t>
+        <w:t>本練習不計分。回歷程本第 2 頁官網原文，找依據、查六句。</w:t>
       </w:r>
     </w:p>
     <w:p>
@@ -105,7 +105,7 @@
           <w:color w:val="1A2340"/>
           <w:sz w:val="30"/>
         </w:rPr>
-        <w:t>公開來源與教師摘要</w:t>
+        <w:t>廣告來源與老師整理的重點</w:t>
       </w:r>
     </w:p>
     <w:p>
@@ -244,7 +244,7 @@
           <w:color w:val="1A2340"/>
           <w:sz w:val="30"/>
         </w:rPr>
-        <w:t>教師編寫的六句待查材料</w:t>
+        <w:t>老師編的六句練習句</w:t>
       </w:r>
     </w:p>
     <w:p>
@@ -363,7 +363,7 @@
           <w:color w:val="1A2340"/>
           <w:sz w:val="22"/>
         </w:rPr>
-        <w:t>在六句圈短語，逐句顏色與短依據留主本3頁；不用重抄。本1–6頁與六句一起備份後交回。沒有裝置由老師協助。</w:t>
+        <w:t>圈出六句中要查的字詞，在歷程本第4頁寫每句的顏色與依據，不用重抄。將六句與歷程本第1、3–6頁拍照上傳，再交回整本；沒有裝置由老師協助。</w:t>
       </w:r>
     </w:p>
     <w:sectPr>

</xml_diff>